<commit_message>
docs(commercial): brochure entreprises — intègre les fonctionnalités du 4 juin
Aligne la brochure du 3 juin avec les 4 lots livrés le 4 juin :
- Vue analytiques flotte dédiée (par catégorie, type d'usage, parc, coût/km)
- Rappels d'entretien automatiques par WhatsApp (scan quotidien → gestionnaires)
- Commande en un clic depuis une alerte d'entretien (recherche pré-remplie
  + fitment, commande rattachée au véhicule — boucle alerte→pièce→commande→coût)

Sections Intelligence flotte + Automatisation enrichies, 3 lignes ajoutées
au tableau récapitulatif. .docx/.pdf régénérés.

Co-Authored-By: Claude Opus 4.8 (1M context) <noreply@anthropic.com>
</commit_message>
<xml_diff>
--- a/docs/brochure-commerciale-entreprises-2026-06-03.docx
+++ b/docs/brochure-commerciale-entreprises-2026-06-03.docx
@@ -641,6 +641,28 @@
         <w:t xml:space="preserve">Reporting avancé : coût/km, par catégorie, mois/mois, exports CSV par flotte</w:t>
       </w:r>
     </w:p>
+    <w:p>
+      <w:pPr>
+        <w:pStyle w:val="Compact"/>
+        <w:numPr>
+          <w:ilvl w:val="0"/>
+          <w:numId w:val="1003"/>
+        </w:numPr>
+      </w:pPr>
+      <w:r>
+        <w:rPr>
+          <w:b/>
+          <w:bCs/>
+        </w:rPr>
+        <w:t xml:space="preserve">Vue analytiques flotte dédiée</w:t>
+      </w:r>
+      <w:r>
+        <w:t xml:space="preserve"> </w:t>
+      </w:r>
+      <w:r>
+        <w:t xml:space="preserve">: une page qui agrège toute la flotte — dépense par catégorie de pièce, par type d'usage (VTC, livraison, BTP…) et par parc/groupe de véhicules, courbe mensuelle sur 12 mois, coût au km moyen et classement des véhicules les plus coûteux au kilomètre. Vous voyez d'un coup où part le budget et quels véhicules tirent vos coûts vers le haut.</w:t>
+      </w:r>
+    </w:p>
     <w:bookmarkEnd w:id="26"/>
     <w:bookmarkStart w:id="27" w:name="gestion-des-chauffeurs-nouveau"/>
     <w:p>
@@ -897,6 +919,50 @@
       </w:pPr>
       <w:r>
         <w:t xml:space="preserve">Alertes prédictives multi-canal (WhatsApp, SMS, email) avant la panne</w:t>
+      </w:r>
+    </w:p>
+    <w:p>
+      <w:pPr>
+        <w:pStyle w:val="Compact"/>
+        <w:numPr>
+          <w:ilvl w:val="0"/>
+          <w:numId w:val="1006"/>
+        </w:numPr>
+      </w:pPr>
+      <w:r>
+        <w:rPr>
+          <w:b/>
+          <w:bCs/>
+        </w:rPr>
+        <w:t xml:space="preserve">Rappels d'entretien automatiques par WhatsApp</w:t>
+      </w:r>
+      <w:r>
+        <w:t xml:space="preserve"> </w:t>
+      </w:r>
+      <w:r>
+        <w:t xml:space="preserve">: un scan quotidien repère les entretiens dus ou en retard et prévient tout seul vos gestionnaires — rien à surveiller, vous êtes notifié au bon moment.</w:t>
+      </w:r>
+    </w:p>
+    <w:p>
+      <w:pPr>
+        <w:pStyle w:val="Compact"/>
+        <w:numPr>
+          <w:ilvl w:val="0"/>
+          <w:numId w:val="1006"/>
+        </w:numPr>
+      </w:pPr>
+      <w:r>
+        <w:rPr>
+          <w:b/>
+          <w:bCs/>
+        </w:rPr>
+        <w:t xml:space="preserve">Commande en un clic depuis l'alerte</w:t>
+      </w:r>
+      <w:r>
+        <w:t xml:space="preserve"> </w:t>
+      </w:r>
+      <w:r>
+        <w:t xml:space="preserve">: chaque alerte d'entretien (tableau de bord) et chaque entretien programmé (fiche véhicule) porte un bouton « Commander ». Au clic, la recherche catalogue est pré-remplie avec la bonne pièce et la compatibilité du véhicule, et la commande est automatiquement rattachée au véhicule pour alimenter son suivi de coûts. La boucle alerte → pièce → commande → coût est fermée, sans ressaisie.</w:t>
       </w:r>
     </w:p>
     <w:p>
@@ -2852,7 +2918,145 @@
               <w:pStyle w:val="Compact"/>
             </w:pPr>
             <w:r>
+              <w:t xml:space="preserve">Vue analytiques flotte (catégorie, usage, parc, coût/km)</w:t>
+            </w:r>
+          </w:p>
+        </w:tc>
+        <w:tc>
+          <w:tcPr/>
+          <w:p>
+            <w:pPr>
+              <w:pStyle w:val="Compact"/>
+            </w:pPr>
+            <w:r>
+              <w:t xml:space="preserve">—</w:t>
+            </w:r>
+          </w:p>
+        </w:tc>
+        <w:tc>
+          <w:tcPr/>
+          <w:p>
+            <w:pPr>
+              <w:pStyle w:val="Compact"/>
+            </w:pPr>
+            <w:r>
+              <w:t xml:space="preserve">✓</w:t>
+            </w:r>
+          </w:p>
+        </w:tc>
+        <w:tc>
+          <w:tcPr/>
+          <w:p>
+            <w:pPr>
+              <w:pStyle w:val="Compact"/>
+            </w:pPr>
+            <w:r>
+              <w:t xml:space="preserve">✓</w:t>
+            </w:r>
+          </w:p>
+        </w:tc>
+      </w:tr>
+      <w:tr>
+        <w:tc>
+          <w:tcPr/>
+          <w:p>
+            <w:pPr>
+              <w:pStyle w:val="Compact"/>
+            </w:pPr>
+            <w:r>
               <w:t xml:space="preserve">Alertes prédictives multi-canal (WhatsApp/SMS/email)</w:t>
+            </w:r>
+          </w:p>
+        </w:tc>
+        <w:tc>
+          <w:tcPr/>
+          <w:p>
+            <w:pPr>
+              <w:pStyle w:val="Compact"/>
+            </w:pPr>
+            <w:r>
+              <w:t xml:space="preserve">—</w:t>
+            </w:r>
+          </w:p>
+        </w:tc>
+        <w:tc>
+          <w:tcPr/>
+          <w:p>
+            <w:pPr>
+              <w:pStyle w:val="Compact"/>
+            </w:pPr>
+            <w:r>
+              <w:t xml:space="preserve">✓</w:t>
+            </w:r>
+          </w:p>
+        </w:tc>
+        <w:tc>
+          <w:tcPr/>
+          <w:p>
+            <w:pPr>
+              <w:pStyle w:val="Compact"/>
+            </w:pPr>
+            <w:r>
+              <w:t xml:space="preserve">✓</w:t>
+            </w:r>
+          </w:p>
+        </w:tc>
+      </w:tr>
+      <w:tr>
+        <w:tc>
+          <w:tcPr/>
+          <w:p>
+            <w:pPr>
+              <w:pStyle w:val="Compact"/>
+            </w:pPr>
+            <w:r>
+              <w:t xml:space="preserve">Rappels d'entretien automatiques par WhatsApp</w:t>
+            </w:r>
+          </w:p>
+        </w:tc>
+        <w:tc>
+          <w:tcPr/>
+          <w:p>
+            <w:pPr>
+              <w:pStyle w:val="Compact"/>
+            </w:pPr>
+            <w:r>
+              <w:t xml:space="preserve">—</w:t>
+            </w:r>
+          </w:p>
+        </w:tc>
+        <w:tc>
+          <w:tcPr/>
+          <w:p>
+            <w:pPr>
+              <w:pStyle w:val="Compact"/>
+            </w:pPr>
+            <w:r>
+              <w:t xml:space="preserve">✓</w:t>
+            </w:r>
+          </w:p>
+        </w:tc>
+        <w:tc>
+          <w:tcPr/>
+          <w:p>
+            <w:pPr>
+              <w:pStyle w:val="Compact"/>
+            </w:pPr>
+            <w:r>
+              <w:t xml:space="preserve">✓</w:t>
+            </w:r>
+          </w:p>
+        </w:tc>
+      </w:tr>
+      <w:tr>
+        <w:tc>
+          <w:tcPr/>
+          <w:p>
+            <w:pPr>
+              <w:pStyle w:val="Compact"/>
+            </w:pPr>
+            <w:r>
+              <w:t xml:space="preserve">Commande en un clic depuis une alerte d'entretien</w:t>
             </w:r>
           </w:p>
         </w:tc>

</xml_diff>

<commit_message>
docs(commercial): révision rédactionnelle brochure entreprises 3 juin
Allègements et reformulations du .md (offre, constat, niveaux, chauffeurs,
automatisation). .docx/.pdf régénérés.

Co-Authored-By: Claude Opus 4.8 (1M context) <noreply@anthropic.com>
</commit_message>
<xml_diff>
--- a/docs/brochure-commerciale-entreprises-2026-06-03.docx
+++ b/docs/brochure-commerciale-entreprises-2026-06-03.docx
@@ -2,7 +2,7 @@
 <file path=word/document.xml><?xml version="1.0" encoding="utf-8"?>
 <w:document xmlns:w="http://schemas.openxmlformats.org/wordprocessingml/2006/main" xmlns:m="http://schemas.openxmlformats.org/officeDocument/2006/math" xmlns:r="http://schemas.openxmlformats.org/officeDocument/2006/relationships" xmlns:o="urn:schemas-microsoft-com:office:office" xmlns:v="urn:schemas-microsoft-com:vml" xmlns:w10="urn:schemas-microsoft-com:office:word" xmlns:a="http://schemas.openxmlformats.org/drawingml/2006/main" xmlns:pic="http://schemas.openxmlformats.org/drawingml/2006/picture" xmlns:wp="http://schemas.openxmlformats.org/drawingml/2006/wordprocessingDrawing">
   <w:body>
-    <w:bookmarkStart w:id="46" w:name="pièces-entreprises--brochure-commerciale"/>
+    <w:bookmarkStart w:id="45" w:name="pièces-entreprises--brochure-commerciale"/>
     <w:p>
       <w:pPr>
         <w:pStyle w:val="Heading1"/>
@@ -16,14 +16,6 @@
         <w:pStyle w:val="FirstParagraph"/>
       </w:pPr>
       <w:r>
-        <w:t xml:space="preserve">Édition de juin 2026 — packaging Flotte Pro à trois niveaux, avec gestion des chauffeurs</w:t>
-      </w:r>
-    </w:p>
-    <w:p>
-      <w:pPr>
-        <w:pStyle w:val="BodyText"/>
-      </w:pPr>
-      <w:r>
         <w:t xml:space="preserve">La plateforme pour les gestionnaires de flotte qui veulent reprendre le contrôle de leur budget pièces, de leur entretien et de la rentabilité de chaque véhicule — chauffeur compris.</w:t>
       </w:r>
     </w:p>
@@ -41,13 +33,7 @@
         <w:pStyle w:val="FirstParagraph"/>
       </w:pPr>
       <w:r>
-        <w:t xml:space="preserve">Trois niveaux, une seule plateforme</w:t>
-      </w:r>
-      <w:r>
-        <w:t xml:space="preserve"> </w:t>
-      </w:r>
-      <w:r>
-        <w:t xml:space="preserve">Pièces se construit en trois étages indépendants. Chacun répond à un besoin distinct ; chacun se prend séparément. Vous montez en étage uniquement quand la valeur que vous y trouvez le justifie.</w:t>
+        <w:t xml:space="preserve">Une plateforme, trois offres.</w:t>
       </w:r>
     </w:p>
     <w:tbl>
@@ -226,7 +212,7 @@
         <w:t xml:space="preserve"> </w:t>
       </w:r>
       <w:r>
-        <w:t xml:space="preserve">: c'est un abonnement unique à 10 000 F/véhicule/mois (prix flat, pas de paliers) qui ajoute la couche urgence — pas un cumul. Vous pouvez aussi rester en gratuit aussi longtemps que vous voulez — pas de gating par taille de flotte.</w:t>
+        <w:t xml:space="preserve">: c'est un abonnement unique à 10 000 F/véhicule/mois qui ajoute la couche urgence.</w:t>
       </w:r>
     </w:p>
     <w:bookmarkEnd w:id="20"/>
@@ -244,7 +230,7 @@
         <w:pStyle w:val="FirstParagraph"/>
       </w:pPr>
       <w:r>
-        <w:t xml:space="preserve">Vous exploitez 5 véhicules ou plus en Côte d'Ivoire et l'entretien — ou le suivi de vos chauffeurs — est devenu un casse-tête ?</w:t>
+        <w:t xml:space="preserve">Vous exploitez 5 véhicules ou plus en Côte d'Ivoire et l'entretien, ou le suivi de vos chauffeurs, peut être amélioré ?</w:t>
       </w:r>
     </w:p>
     <w:p>
@@ -304,7 +290,7 @@
         </w:numPr>
       </w:pPr>
       <w:r>
-        <w:t xml:space="preserve">Services administratifs (parc auto entreprise / ministère)</w:t>
+        <w:t xml:space="preserve">Parcs auto entreprise / administrations</w:t>
       </w:r>
     </w:p>
     <w:p>
@@ -312,7 +298,7 @@
         <w:pStyle w:val="FirstParagraph"/>
       </w:pPr>
       <w:r>
-        <w:t xml:space="preserve">Si vous dépensez plus de 15 millions de FCFA par an en pièces, ou si vous gérez des chauffeurs sans savoir véhicule par véhicule qui rapporte et qui coûte, cette brochure est faite pour vous.</w:t>
+        <w:t xml:space="preserve">Si vous dépensez beaucoup par an en pièces et entretien, ou vous gérez des chauffeurs sans savoir véhicule par véhicule qui rapporte et qui coûte, cette brochure est faite pour vous.</w:t>
       </w:r>
     </w:p>
     <w:bookmarkEnd w:id="21"/>
@@ -322,7 +308,7 @@
         <w:pStyle w:val="Heading2"/>
       </w:pPr>
       <w:r>
-        <w:t xml:space="preserve">Le constat — pourquoi votre flotte coûte plus qu'elle ne devrait</w:t>
+        <w:t xml:space="preserve">Le constat : pourquoi votre flotte coûte plus qu'elle ne devrait</w:t>
       </w:r>
     </w:p>
     <w:p>
@@ -348,13 +334,13 @@
         <w:t xml:space="preserve"> </w:t>
       </w:r>
       <w:r>
-        <w:t xml:space="preserve">Les chauffeurs ne sont pas pilotés. Recette du jour notée sur un cahier, carburant non rapproché, incidents oubliés — vous ne savez pas quel chauffeur ni quel véhicule est réellement rentable.</w:t>
+        <w:t xml:space="preserve">Les chauffeurs ne sont pas pilotés. Recette du jour notée sur un cahier, carburant non rapproché, incidents oubliés : vous ne remarquez pas quel chauffeur ni quel véhicule est réellement rentable.</w:t>
       </w:r>
       <w:r>
         <w:t xml:space="preserve"> </w:t>
       </w:r>
       <w:r>
-        <w:t xml:space="preserve">Les ruptures coûtent cher. Une plaquette qui manque, c'est un véhicule immobilisé 48 h. Deux fois par mois × 20 véhicules = des dizaines de jours perdus par an.</w:t>
+        <w:t xml:space="preserve">Les ruptures coûtent cher. Une plaquette qui manque, c'est un véhicule immobilisé 24, voire 48 h. Deux fois par mois × 20 véhicules = des dizaines de jours perdus par an.</w:t>
       </w:r>
       <w:r>
         <w:t xml:space="preserve"> </w:t>
@@ -392,7 +378,7 @@
         <w:pStyle w:val="BodyText"/>
       </w:pPr>
       <w:r>
-        <w:t xml:space="preserve">La marketplace de référence pour vos pièces auto. Vous arrêtez de surpayer en mettant des dizaines de fournisseurs en concurrence sur chaque pièce, avec la confiance d'une garantie intermédiée par Pièces.</w:t>
+        <w:t xml:space="preserve">La marketplace de référence pour vos pièces auto. Vous arrêtez de surpayer en mettant des fournisseurs en concurrence sur chaque pièce, avec la confiance d'une garantie intermédiée par Pièces.</w:t>
       </w:r>
     </w:p>
     <w:bookmarkEnd w:id="23"/>
@@ -450,7 +436,7 @@
         </w:numPr>
       </w:pPr>
       <w:r>
-        <w:t xml:space="preserve">Garantie pièce intermédiée — vous ne négociez plus avec le fournisseur en cas de défaut</w:t>
+        <w:t xml:space="preserve">Garantie pièce intermédiée</w:t>
       </w:r>
     </w:p>
     <w:p>
@@ -530,7 +516,7 @@
         <w:pStyle w:val="FirstParagraph"/>
       </w:pPr>
       <w:r>
-        <w:t xml:space="preserve">Pièces se rémunère sur la commission fournisseur. Vous ne payez strictement rien pour utiliser la marketplace.</w:t>
+        <w:t xml:space="preserve">Vous ne payez strictement rien pour utiliser la marketplace.</w:t>
       </w:r>
     </w:p>
     <w:bookmarkEnd w:id="24"/>
@@ -590,7 +576,7 @@
         </w:numPr>
       </w:pPr>
       <w:r>
-        <w:t xml:space="preserve">Tableau de bord flotte multi-véhicules : dépenses du mois, alertes maintenance, top 5 véhicules les plus coûteux</w:t>
+        <w:t xml:space="preserve">Tableau de bord flotte multi-véhicules : dépenses du mois, alertes maintenance, classement des véhicules par coût</w:t>
       </w:r>
     </w:p>
     <w:p>
@@ -602,7 +588,7 @@
         </w:numPr>
       </w:pPr>
       <w:r>
-        <w:t xml:space="preserve">Détection automatique des véhicules « gouffres » — coût &gt; 1,5× la moyenne flotte similaire</w:t>
+        <w:t xml:space="preserve">Détection automatique des véhicules « gouffres »</w:t>
       </w:r>
     </w:p>
     <w:p>
@@ -660,27 +646,17 @@
         <w:t xml:space="preserve"> </w:t>
       </w:r>
       <w:r>
-        <w:t xml:space="preserve">: une page qui agrège toute la flotte — dépense par catégorie de pièce, par type d'usage (VTC, livraison, BTP…) et par parc/groupe de véhicules, courbe mensuelle sur 12 mois, coût au km moyen et classement des véhicules les plus coûteux au kilomètre. Vous voyez d'un coup où part le budget et quels véhicules tirent vos coûts vers le haut.</w:t>
+        <w:t xml:space="preserve">: une page qui agrège toute la flotte : dépense par catégorie de pièce, par type d'usage et par parc/groupe de véhicules, courbe mensuelle sur 12 mois, coût au km moyen et classement des véhicules les plus coûteux au kilomètre. Vous voyez d'un coup où part le budget et quels véhicules tirent vos coûts vers le haut.</w:t>
       </w:r>
     </w:p>
     <w:bookmarkEnd w:id="26"/>
-    <w:bookmarkStart w:id="27" w:name="gestion-des-chauffeurs-nouveau"/>
+    <w:bookmarkStart w:id="27" w:name="gestion-des-chauffeurs"/>
     <w:p>
       <w:pPr>
         <w:pStyle w:val="Heading2"/>
       </w:pPr>
       <w:r>
         <w:t xml:space="preserve">Gestion des chauffeurs</w:t>
-      </w:r>
-      <w:r>
-        <w:t xml:space="preserve"> </w:t>
-      </w:r>
-      <w:r>
-        <w:rPr>
-          <w:i/>
-          <w:iCs/>
-        </w:rPr>
-        <w:t xml:space="preserve">(nouveau)</w:t>
       </w:r>
     </w:p>
     <w:p>
@@ -710,7 +686,7 @@
         <w:t xml:space="preserve"> </w:t>
       </w:r>
       <w:r>
-        <w:t xml:space="preserve">: nom, téléphone, numéro et catégorie de permis, photo. Le chauffeur reçoit une invitation et active son compte par OTP — aucune installation, ça marche sur n'importe quel téléphone.</w:t>
+        <w:t xml:space="preserve">: nom, téléphone, numéro et catégorie de permis, photo. Le chauffeur reçoit une invitation et active son compte par OTP : aucune installation, ça marche sur n'importe quel smarttéléphone.</w:t>
       </w:r>
     </w:p>
     <w:p>
@@ -770,55 +746,23 @@
           <w:b/>
           <w:bCs/>
         </w:rPr>
-        <w:t xml:space="preserve">Suivi des incidents</w:t>
+        <w:t xml:space="preserve">KPIs chauffeur</w:t>
       </w:r>
       <w:r>
         <w:t xml:space="preserve"> </w:t>
       </w:r>
       <w:r>
-        <w:t xml:space="preserve">: accident, infraction, panne, plainte client — chacun horodaté, qualifié par gravité (faible / moyenne / élevée) et chiffré (coût estimé). Fini les incidents oubliés.</w:t>
-      </w:r>
-    </w:p>
-    <w:p>
-      <w:pPr>
-        <w:pStyle w:val="Compact"/>
-        <w:numPr>
-          <w:ilvl w:val="0"/>
-          <w:numId w:val="1004"/>
-        </w:numPr>
-      </w:pPr>
-      <w:r>
-        <w:rPr>
-          <w:b/>
-          <w:bCs/>
-        </w:rPr>
-        <w:t xml:space="preserve">KPIs chauffeur</w:t>
-      </w:r>
-      <w:r>
-        <w:t xml:space="preserve"> </w:t>
-      </w:r>
-      <w:r>
         <w:t xml:space="preserve">: recette nette par chauffeur, tendance, comparaison entre chauffeurs et entre véhicules. Vous voyez enfin qui rapporte, qui coûte, et où agir.</w:t>
       </w:r>
     </w:p>
     <w:bookmarkEnd w:id="27"/>
-    <w:bookmarkStart w:id="28" w:name="espace-chauffeur-en-self-service-nouveau"/>
+    <w:bookmarkStart w:id="28" w:name="espace-chauffeur"/>
     <w:p>
       <w:pPr>
         <w:pStyle w:val="Heading2"/>
       </w:pPr>
       <w:r>
-        <w:t xml:space="preserve">Espace chauffeur en self-service</w:t>
-      </w:r>
-      <w:r>
-        <w:t xml:space="preserve"> </w:t>
-      </w:r>
-      <w:r>
-        <w:rPr>
-          <w:i/>
-          <w:iCs/>
-        </w:rPr>
-        <w:t xml:space="preserve">(nouveau)</w:t>
+        <w:t xml:space="preserve">Espace chauffeur</w:t>
       </w:r>
     </w:p>
     <w:p>
@@ -940,7 +884,7 @@
         <w:t xml:space="preserve"> </w:t>
       </w:r>
       <w:r>
-        <w:t xml:space="preserve">: un scan quotidien repère les entretiens dus ou en retard et prévient tout seul vos gestionnaires — rien à surveiller, vous êtes notifié au bon moment.</w:t>
+        <w:t xml:space="preserve">: un scan quotidien repère les entretiens dus ou en retard et prévient tout seul vos gestionnaires : rien à surveiller, vous êtes notifié au bon moment.</w:t>
       </w:r>
     </w:p>
     <w:p>
@@ -1042,7 +986,7 @@
         <w:t xml:space="preserve"> </w:t>
       </w:r>
       <w:r>
-        <w:t xml:space="preserve">sur chaque commande — numéro de validation, QR code, mentions obligatoires, conformes au standard de la Direction Générale des Impôts.</w:t>
+        <w:t xml:space="preserve">sur chaque commande : numéro de validation, QR code, mentions obligatoires, conformes au standard de la Direction Générale des Impôts.</w:t>
       </w:r>
     </w:p>
     <w:p>
@@ -1108,7 +1052,7 @@
         </w:numPr>
       </w:pPr>
       <w:r>
-        <w:t xml:space="preserve">Devis PDF et PDF historique véhicule signés Pièces — arguments forts à la revente</w:t>
+        <w:t xml:space="preserve">Devis PDF et PDF historique véhicule signés Pièces</w:t>
       </w:r>
     </w:p>
     <w:p>
@@ -1466,7 +1410,7 @@
         <w:t xml:space="preserve">10 000 F / véhicule / mois</w:t>
       </w:r>
       <w:r>
-        <w:t xml:space="preserve">, prix flat (pas de paliers). Flotte Pro + remplace Flotte Pro — vous ne cumulez pas les deux. Exemple flotte 20 véhicules :</w:t>
+        <w:t xml:space="preserve">, prix unique. Flotte Pro + remplace Flotte Pro — vous ne cumulez pas les deux. Exemple flotte 20 véhicules :</w:t>
       </w:r>
       <w:r>
         <w:t xml:space="preserve"> </w:t>
@@ -1513,7 +1457,7 @@
         </w:numPr>
       </w:pPr>
       <w:r>
-        <w:t xml:space="preserve">5 livraisons express incluses par mois — au-delà, 1 500 F par livraison supplémentaire</w:t>
+        <w:t xml:space="preserve">5 livraisons express incluses par mois : au-delà, 1 500 F par livraison supplémentaire</w:t>
       </w:r>
     </w:p>
     <w:bookmarkEnd w:id="33"/>
@@ -1593,7 +1537,7 @@
         </w:numPr>
       </w:pPr>
       <w:r>
-        <w:t xml:space="preserve">Concierge dépannage : un appel, Pièces trouve la pièce et l'achemine — même si elle n'est pas dans le catalogue</w:t>
+        <w:t xml:space="preserve">Concierge dépannage : un appel, Pièces trouve la pièce et l'achemine : même si elle n'est pas dans le catalogue</w:t>
       </w:r>
     </w:p>
     <w:bookmarkEnd w:id="35"/>
@@ -3884,13 +3828,13 @@
       </w:r>
     </w:p>
     <w:bookmarkEnd w:id="37"/>
-    <w:bookmarkStart w:id="38" w:name="garantie-roi-à-3-mois"/>
+    <w:bookmarkStart w:id="38" w:name="paiement-annuel--2-mois-offerts"/>
     <w:p>
       <w:pPr>
         <w:pStyle w:val="Heading2"/>
       </w:pPr>
       <w:r>
-        <w:t xml:space="preserve">Garantie ROI à 3 mois</w:t>
+        <w:t xml:space="preserve">Paiement annuel = 2 mois offerts</w:t>
       </w:r>
     </w:p>
     <w:p>
@@ -3898,17 +3842,17 @@
         <w:pStyle w:val="FirstParagraph"/>
       </w:pPr>
       <w:r>
-        <w:t xml:space="preserve">Si à 3 mois Flotte Pro ne vous a pas fait économiser au moins l'équivalent de l'abonnement, vous repassez en gratuit et nous vous remboursons la dernière mensualité. Nous prenons le risque.</w:t>
+        <w:t xml:space="preserve">Payer Flotte Pro annuellement d'avance vous fait gagner l'équivalent de 2 mois (16,7 % de remise effective). Cash up-front pour vous, prévisibilité pour nous. Idéal pour les flottes structurées.</w:t>
       </w:r>
     </w:p>
     <w:bookmarkEnd w:id="38"/>
-    <w:bookmarkStart w:id="39" w:name="paiement-annuel--2-mois-offerts"/>
+    <w:bookmarkStart w:id="39" w:name="calculateur-roi-à-linscription"/>
     <w:p>
       <w:pPr>
         <w:pStyle w:val="Heading2"/>
       </w:pPr>
       <w:r>
-        <w:t xml:space="preserve">Paiement annuel = 2 mois offerts</w:t>
+        <w:t xml:space="preserve">Calculateur ROI à l'inscription</w:t>
       </w:r>
     </w:p>
     <w:p>
@@ -3916,17 +3860,17 @@
         <w:pStyle w:val="FirstParagraph"/>
       </w:pPr>
       <w:r>
-        <w:t xml:space="preserve">Payer Flotte Pro annuellement d'avance vous fait gagner l'équivalent de 2 mois (16,7 % de remise effective). Cash up-front pour vous, prévisibilité pour nous. Idéal pour les services administratifs et les flottes structurées.</w:t>
+        <w:t xml:space="preserve">Avant même de saisir vos véhicules, indiquez votre budget pièces annuel. Pièces calcule en temps réel l'économie projetée, le coût Flotte Pro (5 000 F × véhicules), et le ROI net. La décision devient une évidence arithmétique. Le calculateur est aussi accessible en ligne sur pieces.ci/entreprises/calculateur-roi.</w:t>
       </w:r>
     </w:p>
     <w:bookmarkEnd w:id="39"/>
-    <w:bookmarkStart w:id="40" w:name="calculateur-roi-à-linscription"/>
+    <w:bookmarkStart w:id="40" w:name="Xeebc77e62dcf2cba9b5883dcd894e79cee7f8b4"/>
     <w:p>
       <w:pPr>
         <w:pStyle w:val="Heading2"/>
       </w:pPr>
       <w:r>
-        <w:t xml:space="preserve">Calculateur ROI à l'inscription</w:t>
+        <w:t xml:space="preserve">Notre modèle économique, en transparence totale</w:t>
       </w:r>
     </w:p>
     <w:p>
@@ -3934,53 +3878,35 @@
         <w:pStyle w:val="FirstParagraph"/>
       </w:pPr>
       <w:r>
-        <w:t xml:space="preserve">Avant même de saisir vos véhicules, indiquez votre budget pièces annuel. Pièces calcule en temps réel l'économie projetée, le coût Flotte Pro (5 000 F × véhicules), et le ROI net. La décision devient une évidence arithmétique. Le calculateur est aussi accessible en ligne sur pieces.ci/entreprises/calculateur-roi.</w:t>
+        <w:t xml:space="preserve">Commission marketplace Prélevée auprès du fournisseur sur chaque commande (5–10 %). C'est notre revenu de base, présent quel que soit votre niveau.</w:t>
+      </w:r>
+    </w:p>
+    <w:p>
+      <w:pPr>
+        <w:pStyle w:val="BodyText"/>
+      </w:pPr>
+      <w:r>
+        <w:t xml:space="preserve">Flotte Pro 5 000 F / véhicule / mois. Couvre l'analytique, la gestion des chauffeurs, l'automatisation et la facturation normalisée.</w:t>
+      </w:r>
+    </w:p>
+    <w:p>
+      <w:pPr>
+        <w:pStyle w:val="BodyText"/>
+      </w:pPr>
+      <w:r>
+        <w:t xml:space="preserve">Flotte Pro + 10 000 F / véhicule / mois. Couvre tout Flotte Pro plus les surcoûts logistiques de l'urgence et de l'assistance dédiée.</w:t>
+      </w:r>
+    </w:p>
+    <w:p>
+      <w:pPr>
+        <w:pStyle w:val="BodyText"/>
+      </w:pPr>
+      <w:r>
+        <w:t xml:space="preserve">Pas de marge cachée sur les pièces. Pas de frais d'entrée. Pas de droit de regard sur vos commandes hors plateforme. Notre incitatif est aligné sur le vôtre : plus vous économisez, plus vous restez.</w:t>
       </w:r>
     </w:p>
     <w:bookmarkEnd w:id="40"/>
-    <w:bookmarkStart w:id="41" w:name="Xeebc77e62dcf2cba9b5883dcd894e79cee7f8b4"/>
-    <w:p>
-      <w:pPr>
-        <w:pStyle w:val="Heading2"/>
-      </w:pPr>
-      <w:r>
-        <w:t xml:space="preserve">Notre modèle économique, en transparence totale</w:t>
-      </w:r>
-    </w:p>
-    <w:p>
-      <w:pPr>
-        <w:pStyle w:val="FirstParagraph"/>
-      </w:pPr>
-      <w:r>
-        <w:t xml:space="preserve">Commission marketplace Prélevée auprès du fournisseur sur chaque commande (5–10 %). C'est notre revenu de base, présent quel que soit votre niveau.</w:t>
-      </w:r>
-    </w:p>
-    <w:p>
-      <w:pPr>
-        <w:pStyle w:val="BodyText"/>
-      </w:pPr>
-      <w:r>
-        <w:t xml:space="preserve">Flotte Pro 5 000 F / véhicule / mois. Couvre l'analytique, la gestion des chauffeurs, l'automatisation et la facturation normalisée.</w:t>
-      </w:r>
-    </w:p>
-    <w:p>
-      <w:pPr>
-        <w:pStyle w:val="BodyText"/>
-      </w:pPr>
-      <w:r>
-        <w:t xml:space="preserve">Flotte Pro + 10 000 F / véhicule / mois. Couvre tout Flotte Pro plus les surcoûts logistiques de l'urgence et de l'assistance dédiée.</w:t>
-      </w:r>
-    </w:p>
-    <w:p>
-      <w:pPr>
-        <w:pStyle w:val="BodyText"/>
-      </w:pPr>
-      <w:r>
-        <w:t xml:space="preserve">Pas de marge cachée sur les pièces. Pas de frais d'entrée. Pas de droit de regard sur vos commandes hors plateforme. Notre incitatif est aligné sur le vôtre : plus vous économisez, plus vous restez.</w:t>
-      </w:r>
-    </w:p>
-    <w:bookmarkEnd w:id="41"/>
-    <w:bookmarkStart w:id="42" w:name="Xcaf67d62636605794cedd4e9673043a4a88a403"/>
+    <w:bookmarkStart w:id="41" w:name="Xcaf67d62636605794cedd4e9673043a4a88a403"/>
     <w:p>
       <w:pPr>
         <w:pStyle w:val="Heading2"/>
@@ -4327,8 +4253,8 @@
         <w:t xml:space="preserve">Sur 300 M FCFA de budget annuel, l'économie cible est de 60 à 90 M FCFA par an, pour un investissement Flotte Pro de 6,0 M FCFA (100 véhicules × 5 000 F × 12 mois). Le ROI net minimum est de +54 M FCFA — avant même les recettes chauffeurs mieux suivies.</w:t>
       </w:r>
     </w:p>
-    <w:bookmarkEnd w:id="42"/>
-    <w:bookmarkStart w:id="43" w:name="comment-démarrer"/>
+    <w:bookmarkEnd w:id="41"/>
+    <w:bookmarkStart w:id="42" w:name="comment-démarrer"/>
     <w:p>
       <w:pPr>
         <w:pStyle w:val="Heading2"/>
@@ -4433,8 +4359,8 @@
         <w:t xml:space="preserve">À J+30, choisissez : continuer en Flotte Pro, revenir au gratuit, ou passer en Flotte Pro +. Délai moyen de mise en route : 48 h ouvrées.</w:t>
       </w:r>
     </w:p>
-    <w:bookmarkEnd w:id="43"/>
-    <w:bookmarkStart w:id="45" w:name="contact"/>
+    <w:bookmarkEnd w:id="42"/>
+    <w:bookmarkStart w:id="44" w:name="contact"/>
     <w:p>
       <w:pPr>
         <w:pStyle w:val="Heading2"/>
@@ -4453,7 +4379,7 @@
       <w:r>
         <w:t xml:space="preserve"> </w:t>
       </w:r>
-      <w:hyperlink r:id="rId44">
+      <w:hyperlink r:id="rId43">
         <w:r>
           <w:rPr>
             <w:rStyle w:val="Hyperlink"/>
@@ -4470,8 +4396,8 @@
         <w:t xml:space="preserve">Brochure éditée à partir du packaging Flotte Pro au 3 juin 2026. Pour les conditions générales d'utilisation, voir pieces.ci/cgu.</w:t>
       </w:r>
     </w:p>
+    <w:bookmarkEnd w:id="44"/>
     <w:bookmarkEnd w:id="45"/>
-    <w:bookmarkEnd w:id="46"/>
     <w:sectPr/>
   </w:body>
 </w:document>

</xml_diff>